<commit_message>
Docs: drop levelDEVIL inspiration references from README, project description and GDD
</commit_message>
<xml_diff>
--- a/docs/MindTrapa_EN.docx
+++ b/docs/MindTrapa_EN.docx
@@ -142,24 +142,6 @@
           <w:sz w:val="22"/>
         </w:rPr>
         <w:t>Ivan Danisheuski (BarriRin), solo project</w:t>
-      </w:r>
-    </w:p>
-    <w:p>
-      <w:pPr>
-        <w:spacing w:before="20" w:after="20"/>
-      </w:pPr>
-      <w:r>
-        <w:rPr>
-          <w:b/>
-          <w:sz w:val="22"/>
-        </w:rPr>
-        <w:t xml:space="preserve">Inspiration:      </w:t>
-      </w:r>
-      <w:r>
-        <w:rPr>
-          <w:sz w:val="22"/>
-        </w:rPr>
-        <w:t>levelDEVIL</w:t>
       </w:r>
     </w:p>
     <w:p/>

</xml_diff>